<commit_message>
Replace StaffVA Scope v6.3 with updated version
Co-Authored-By: Claude Opus 4.6 (1M context) <noreply@anthropic.com>
</commit_message>
<xml_diff>
--- a/data-room/StaffVA_Scope_v6_3.docx
+++ b/data-room/StaffVA_Scope_v6_3.docx
@@ -664,6 +664,32 @@
             </w:pPr>
             <w:r>
               <w:t xml:space="preserve">Verified earnings badge now shows a bucketed range label on the browse card. Buckets: $1–$4,999 = $1K+ earned; $5K–$9,999 = $5K+ earned; $10K–$24,999 = $10K+ earned; $25K–$49,999 = $25K+ earned; $50K–$99,999 = $50K+ earned; $100K+ = $100K+ earned. Raw total_earnings_usd is never exposed publicly. Badge is hidden if total_earnings_usd is zero or null. No database changes required.</w:t>
+            </w:r>
+          </w:p>
+        </w:tc>
+      </w:tr>
+      <w:tr>
+        <w:tc>
+          <w:tcPr/>
+          <w:p>
+            <w:pPr>
+              <w:pStyle w:val="Compact"/>
+              <w:jc w:val="left"/>
+            </w:pPr>
+            <w:r>
+              <w:t xml:space="preserve">AI Insights Panel</w:t>
+            </w:r>
+          </w:p>
+        </w:tc>
+        <w:tc>
+          <w:tcPr/>
+          <w:p>
+            <w:pPr>
+              <w:pStyle w:val="Compact"/>
+              <w:jc w:val="left"/>
+            </w:pPr>
+            <w:r>
+              <w:t xml:space="preserve">Two AI-generated insight bullets rendered on each browse card below the skill tags. Generated by Claude API async background job from three data sources: candidate profile (bio, tagline, skills, tools, role category, US client experience, years of experience), AI first interview score and result tier, and second interview scorecard (Communication Clarity, Professional Demeanor, Role Knowledge scores). The 2 strongest insights stored on the candidate record. Regenerates on profile approval, AI interview completion, and second interview scoring. Moved from Phase 2 to Phase 1.</w:t>
             </w:r>
           </w:p>
         </w:tc>
@@ -6992,12 +7018,669 @@
           <w:bCs/>
           <w:b/>
         </w:rPr>
-        <w:t xml:space="preserve">SECTION 12</w:t>
+        <w:t xml:space="preserve">SECTION 11C</w:t>
       </w:r>
     </w:p>
     <w:bookmarkEnd w:id="55"/>
     <w:bookmarkEnd w:id="56"/>
-    <w:bookmarkStart w:id="58" w:name="browse-page-hire-staff"/>
+    <w:bookmarkStart w:id="62" w:name="ai-insights-panel-browse-card"/>
+    <w:p>
+      <w:pPr>
+        <w:pStyle w:val="Heading1"/>
+      </w:pPr>
+      <w:r>
+        <w:rPr>
+          <w:bCs/>
+          <w:b/>
+        </w:rPr>
+        <w:t xml:space="preserve">AI Insights Panel — Browse Card</w:t>
+      </w:r>
+    </w:p>
+    <w:p>
+      <w:pPr>
+        <w:pStyle w:val="FirstParagraph"/>
+      </w:pPr>
+      <w:r>
+        <w:t xml:space="preserve">Two AI-generated insight bullets displayed on each approved candidate’s browse card, below the skill tags. Generated by Claude API as an async background job. Stored on the candidate record. Not generated per search query — generated from the candidate’s own data and updated automatically when that data changes.</w:t>
+      </w:r>
+    </w:p>
+    <w:bookmarkStart w:id="57" w:name="data-sources"/>
+    <w:p>
+      <w:pPr>
+        <w:pStyle w:val="Heading2"/>
+      </w:pPr>
+      <w:r>
+        <w:rPr>
+          <w:bCs/>
+          <w:b/>
+        </w:rPr>
+        <w:t xml:space="preserve">Data Sources</w:t>
+      </w:r>
+    </w:p>
+    <w:tbl>
+      <w:tblPr>
+        <w:tblStyle w:val="Table"/>
+        <w:tblW w:type="pct" w:w="5000"/>
+        <w:tblLook w:firstRow="1" w:lastRow="0" w:firstColumn="0" w:lastColumn="0" w:noHBand="0" w:noVBand="0" w:val="0020"/>
+        <w:jc w:val="start"/>
+      </w:tblPr>
+      <w:tblGrid>
+        <w:gridCol w:w="3960"/>
+        <w:gridCol w:w="3960"/>
+      </w:tblGrid>
+      <w:tr>
+        <w:trPr>
+          <w:tblHeader w:val="true"/>
+        </w:trPr>
+        <w:tc>
+          <w:tcPr/>
+          <w:p>
+            <w:pPr>
+              <w:pStyle w:val="Compact"/>
+              <w:jc w:val="left"/>
+            </w:pPr>
+            <w:r>
+              <w:rPr>
+                <w:bCs/>
+                <w:b/>
+              </w:rPr>
+              <w:t xml:space="preserve">Source</w:t>
+            </w:r>
+          </w:p>
+        </w:tc>
+        <w:tc>
+          <w:tcPr/>
+          <w:p>
+            <w:pPr>
+              <w:pStyle w:val="Compact"/>
+              <w:jc w:val="left"/>
+            </w:pPr>
+            <w:r>
+              <w:rPr>
+                <w:bCs/>
+                <w:b/>
+              </w:rPr>
+              <w:t xml:space="preserve">Fields Used</w:t>
+            </w:r>
+          </w:p>
+        </w:tc>
+      </w:tr>
+      <w:tr>
+        <w:tc>
+          <w:tcPr/>
+          <w:p>
+            <w:pPr>
+              <w:pStyle w:val="Compact"/>
+              <w:jc w:val="left"/>
+            </w:pPr>
+            <w:r>
+              <w:t xml:space="preserve">Candidate profile</w:t>
+            </w:r>
+          </w:p>
+        </w:tc>
+        <w:tc>
+          <w:tcPr/>
+          <w:p>
+            <w:pPr>
+              <w:pStyle w:val="Compact"/>
+              <w:jc w:val="left"/>
+            </w:pPr>
+            <w:r>
+              <w:t xml:space="preserve">role_category, years_experience, bio, tagline, skills array, tools array, us_client_experience, us_client_description</w:t>
+            </w:r>
+          </w:p>
+        </w:tc>
+      </w:tr>
+      <w:tr>
+        <w:tc>
+          <w:tcPr/>
+          <w:p>
+            <w:pPr>
+              <w:pStyle w:val="Compact"/>
+              <w:jc w:val="left"/>
+            </w:pPr>
+            <w:r>
+              <w:t xml:space="preserve">AI first interview</w:t>
+            </w:r>
+          </w:p>
+        </w:tc>
+        <w:tc>
+          <w:tcPr/>
+          <w:p>
+            <w:pPr>
+              <w:pStyle w:val="Compact"/>
+              <w:jc w:val="left"/>
+            </w:pPr>
+            <w:r>
+              <w:t xml:space="preserve">ai_interview_score, ai_interview_completed_at, result tier (Expert / Proficient / Developing / Not Ready)</w:t>
+            </w:r>
+          </w:p>
+        </w:tc>
+      </w:tr>
+      <w:tr>
+        <w:tc>
+          <w:tcPr/>
+          <w:p>
+            <w:pPr>
+              <w:pStyle w:val="Compact"/>
+              <w:jc w:val="left"/>
+            </w:pPr>
+            <w:r>
+              <w:t xml:space="preserve">Second interview scorecard</w:t>
+            </w:r>
+          </w:p>
+        </w:tc>
+        <w:tc>
+          <w:tcPr/>
+          <w:p>
+            <w:pPr>
+              <w:pStyle w:val="Compact"/>
+              <w:jc w:val="left"/>
+            </w:pPr>
+            <w:r>
+              <w:t xml:space="preserve">Communication Clarity score (out of 5), Professional Demeanor score (out of 5), Role Knowledge score (out of 5) — from candidate_interviews table</w:t>
+            </w:r>
+          </w:p>
+        </w:tc>
+      </w:tr>
+    </w:tbl>
+    <w:bookmarkEnd w:id="57"/>
+    <w:bookmarkStart w:id="58" w:name="generation-triggers"/>
+    <w:p>
+      <w:pPr>
+        <w:pStyle w:val="Heading2"/>
+      </w:pPr>
+      <w:r>
+        <w:rPr>
+          <w:bCs/>
+          <w:b/>
+        </w:rPr>
+        <w:t xml:space="preserve">Generation Triggers</w:t>
+      </w:r>
+    </w:p>
+    <w:p>
+      <w:pPr>
+        <w:pStyle w:val="FirstParagraph"/>
+      </w:pPr>
+      <w:r>
+        <w:t xml:space="preserve">Async background job fires automatically on any of these three events:</w:t>
+      </w:r>
+    </w:p>
+    <w:tbl>
+      <w:tblPr>
+        <w:tblStyle w:val="Table"/>
+        <w:tblW w:type="pct" w:w="5000"/>
+        <w:tblLook w:firstRow="1" w:lastRow="0" w:firstColumn="0" w:lastColumn="0" w:noHBand="0" w:noVBand="0" w:val="0020"/>
+        <w:jc w:val="start"/>
+      </w:tblPr>
+      <w:tblGrid>
+        <w:gridCol w:w="3960"/>
+        <w:gridCol w:w="3960"/>
+      </w:tblGrid>
+      <w:tr>
+        <w:trPr>
+          <w:tblHeader w:val="true"/>
+        </w:trPr>
+        <w:tc>
+          <w:tcPr/>
+          <w:p>
+            <w:pPr>
+              <w:pStyle w:val="Compact"/>
+              <w:jc w:val="left"/>
+            </w:pPr>
+            <w:r>
+              <w:rPr>
+                <w:bCs/>
+                <w:b/>
+              </w:rPr>
+              <w:t xml:space="preserve">Trigger</w:t>
+            </w:r>
+          </w:p>
+        </w:tc>
+        <w:tc>
+          <w:tcPr/>
+          <w:p>
+            <w:pPr>
+              <w:pStyle w:val="Compact"/>
+              <w:jc w:val="left"/>
+            </w:pPr>
+            <w:r>
+              <w:rPr>
+                <w:bCs/>
+                <w:b/>
+              </w:rPr>
+              <w:t xml:space="preserve">Event</w:t>
+            </w:r>
+          </w:p>
+        </w:tc>
+      </w:tr>
+      <w:tr>
+        <w:tc>
+          <w:tcPr/>
+          <w:p>
+            <w:pPr>
+              <w:pStyle w:val="Compact"/>
+              <w:jc w:val="left"/>
+            </w:pPr>
+            <w:r>
+              <w:t xml:space="preserve">Profile approval</w:t>
+            </w:r>
+          </w:p>
+        </w:tc>
+        <w:tc>
+          <w:tcPr/>
+          <w:p>
+            <w:pPr>
+              <w:pStyle w:val="Compact"/>
+              <w:jc w:val="left"/>
+            </w:pPr>
+            <w:r>
+              <w:t xml:space="preserve">admin_status changes to approved</w:t>
+            </w:r>
+          </w:p>
+        </w:tc>
+      </w:tr>
+      <w:tr>
+        <w:tc>
+          <w:tcPr/>
+          <w:p>
+            <w:pPr>
+              <w:pStyle w:val="Compact"/>
+              <w:jc w:val="left"/>
+            </w:pPr>
+            <w:r>
+              <w:t xml:space="preserve">AI interview completion</w:t>
+            </w:r>
+          </w:p>
+        </w:tc>
+        <w:tc>
+          <w:tcPr/>
+          <w:p>
+            <w:pPr>
+              <w:pStyle w:val="Compact"/>
+              <w:jc w:val="left"/>
+            </w:pPr>
+            <w:r>
+              <w:t xml:space="preserve">ai_interview_completed_at written back to candidates table</w:t>
+            </w:r>
+          </w:p>
+        </w:tc>
+      </w:tr>
+      <w:tr>
+        <w:tc>
+          <w:tcPr/>
+          <w:p>
+            <w:pPr>
+              <w:pStyle w:val="Compact"/>
+              <w:jc w:val="left"/>
+            </w:pPr>
+            <w:r>
+              <w:t xml:space="preserve">Second interview scored</w:t>
+            </w:r>
+          </w:p>
+        </w:tc>
+        <w:tc>
+          <w:tcPr/>
+          <w:p>
+            <w:pPr>
+              <w:pStyle w:val="Compact"/>
+              <w:jc w:val="left"/>
+            </w:pPr>
+            <w:r>
+              <w:t xml:space="preserve">candidate_interviews record updated with all three scores</w:t>
+            </w:r>
+          </w:p>
+        </w:tc>
+      </w:tr>
+    </w:tbl>
+    <w:bookmarkEnd w:id="58"/>
+    <w:bookmarkStart w:id="59" w:name="claude-api-prompt-logic"/>
+    <w:p>
+      <w:pPr>
+        <w:pStyle w:val="Heading2"/>
+      </w:pPr>
+      <w:r>
+        <w:rPr>
+          <w:bCs/>
+          <w:b/>
+        </w:rPr>
+        <w:t xml:space="preserve">Claude API Prompt Logic</w:t>
+      </w:r>
+    </w:p>
+    <w:p>
+      <w:pPr>
+        <w:pStyle w:val="FirstParagraph"/>
+      </w:pPr>
+      <w:r>
+        <w:t xml:space="preserve">The job assembles all available data from the three sources and sends to claude-sonnet-4-6. Prompt instructs Claude to return exactly 2 insights — the two strongest signals a US client would find most valuable when evaluating this candidate. Each insight must be specific to this candidate, not generic. Max 20 words per insight. If second interview data is not yet available, generate insights from profile and AI interview only. If AI interview is also not yet available, generate from profile only.</w:t>
+      </w:r>
+    </w:p>
+    <w:p>
+      <w:pPr>
+        <w:pStyle w:val="BodyText"/>
+      </w:pPr>
+      <w:r>
+        <w:t xml:space="preserve">Response format: JSON array of exactly 2 strings. Example: [</w:t>
+      </w:r>
+      <w:r>
+        <w:t xml:space="preserve">“</w:t>
+      </w:r>
+      <w:r>
+        <w:t xml:space="preserve">7 years of bookkeeping experience with US e-commerce clients across QuickBooks and Xero.</w:t>
+      </w:r>
+      <w:r>
+        <w:t xml:space="preserve">”</w:t>
+      </w:r>
+      <w:r>
+        <w:t xml:space="preserve">,</w:t>
+      </w:r>
+      <w:r>
+        <w:t xml:space="preserve"> </w:t>
+      </w:r>
+      <w:r>
+        <w:t xml:space="preserve">“</w:t>
+      </w:r>
+      <w:r>
+        <w:t xml:space="preserve">Scored Expert tier on AI interview — top 10% of all StaffVA candidates assessed.</w:t>
+      </w:r>
+      <w:r>
+        <w:t xml:space="preserve">”</w:t>
+      </w:r>
+      <w:r>
+        <w:t xml:space="preserve">]</w:t>
+      </w:r>
+    </w:p>
+    <w:bookmarkEnd w:id="59"/>
+    <w:bookmarkStart w:id="60" w:name="storage"/>
+    <w:p>
+      <w:pPr>
+        <w:pStyle w:val="Heading2"/>
+      </w:pPr>
+      <w:r>
+        <w:rPr>
+          <w:bCs/>
+          <w:b/>
+        </w:rPr>
+        <w:t xml:space="preserve">Storage</w:t>
+      </w:r>
+    </w:p>
+    <w:tbl>
+      <w:tblPr>
+        <w:tblStyle w:val="Table"/>
+        <w:tblW w:type="pct" w:w="5000"/>
+        <w:tblLook w:firstRow="1" w:lastRow="0" w:firstColumn="0" w:lastColumn="0" w:noHBand="0" w:noVBand="0" w:val="0020"/>
+        <w:jc w:val="start"/>
+      </w:tblPr>
+      <w:tblGrid>
+        <w:gridCol w:w="2640"/>
+        <w:gridCol w:w="2640"/>
+        <w:gridCol w:w="2640"/>
+      </w:tblGrid>
+      <w:tr>
+        <w:trPr>
+          <w:tblHeader w:val="true"/>
+        </w:trPr>
+        <w:tc>
+          <w:tcPr/>
+          <w:p>
+            <w:pPr>
+              <w:pStyle w:val="Compact"/>
+              <w:jc w:val="left"/>
+            </w:pPr>
+            <w:r>
+              <w:rPr>
+                <w:bCs/>
+                <w:b/>
+              </w:rPr>
+              <w:t xml:space="preserve">New Column</w:t>
+            </w:r>
+          </w:p>
+        </w:tc>
+        <w:tc>
+          <w:tcPr/>
+          <w:p>
+            <w:pPr>
+              <w:pStyle w:val="Compact"/>
+              <w:jc w:val="left"/>
+            </w:pPr>
+            <w:r>
+              <w:rPr>
+                <w:bCs/>
+                <w:b/>
+              </w:rPr>
+              <w:t xml:space="preserve">Type</w:t>
+            </w:r>
+          </w:p>
+        </w:tc>
+        <w:tc>
+          <w:tcPr/>
+          <w:p>
+            <w:pPr>
+              <w:pStyle w:val="Compact"/>
+              <w:jc w:val="left"/>
+            </w:pPr>
+            <w:r>
+              <w:rPr>
+                <w:bCs/>
+                <w:b/>
+              </w:rPr>
+              <w:t xml:space="preserve">Notes</w:t>
+            </w:r>
+          </w:p>
+        </w:tc>
+      </w:tr>
+      <w:tr>
+        <w:tc>
+          <w:tcPr/>
+          <w:p>
+            <w:pPr>
+              <w:pStyle w:val="Compact"/>
+              <w:jc w:val="left"/>
+            </w:pPr>
+            <w:r>
+              <w:t xml:space="preserve">ai_insight_1</w:t>
+            </w:r>
+          </w:p>
+        </w:tc>
+        <w:tc>
+          <w:tcPr/>
+          <w:p>
+            <w:pPr>
+              <w:pStyle w:val="Compact"/>
+              <w:jc w:val="left"/>
+            </w:pPr>
+            <w:r>
+              <w:t xml:space="preserve">text</w:t>
+            </w:r>
+          </w:p>
+        </w:tc>
+        <w:tc>
+          <w:tcPr/>
+          <w:p>
+            <w:pPr>
+              <w:pStyle w:val="Compact"/>
+              <w:jc w:val="left"/>
+            </w:pPr>
+            <w:r>
+              <w:t xml:space="preserve">First insight bullet. Nullable.</w:t>
+            </w:r>
+          </w:p>
+        </w:tc>
+      </w:tr>
+      <w:tr>
+        <w:tc>
+          <w:tcPr/>
+          <w:p>
+            <w:pPr>
+              <w:pStyle w:val="Compact"/>
+              <w:jc w:val="left"/>
+            </w:pPr>
+            <w:r>
+              <w:t xml:space="preserve">ai_insight_2</w:t>
+            </w:r>
+          </w:p>
+        </w:tc>
+        <w:tc>
+          <w:tcPr/>
+          <w:p>
+            <w:pPr>
+              <w:pStyle w:val="Compact"/>
+              <w:jc w:val="left"/>
+            </w:pPr>
+            <w:r>
+              <w:t xml:space="preserve">text</w:t>
+            </w:r>
+          </w:p>
+        </w:tc>
+        <w:tc>
+          <w:tcPr/>
+          <w:p>
+            <w:pPr>
+              <w:pStyle w:val="Compact"/>
+              <w:jc w:val="left"/>
+            </w:pPr>
+            <w:r>
+              <w:t xml:space="preserve">Second insight bullet. Nullable.</w:t>
+            </w:r>
+          </w:p>
+        </w:tc>
+      </w:tr>
+      <w:tr>
+        <w:tc>
+          <w:tcPr/>
+          <w:p>
+            <w:pPr>
+              <w:pStyle w:val="Compact"/>
+              <w:jc w:val="left"/>
+            </w:pPr>
+            <w:r>
+              <w:t xml:space="preserve">ai_insights_generated_at</w:t>
+            </w:r>
+          </w:p>
+        </w:tc>
+        <w:tc>
+          <w:tcPr/>
+          <w:p>
+            <w:pPr>
+              <w:pStyle w:val="Compact"/>
+              <w:jc w:val="left"/>
+            </w:pPr>
+            <w:r>
+              <w:t xml:space="preserve">timestamp</w:t>
+            </w:r>
+          </w:p>
+        </w:tc>
+        <w:tc>
+          <w:tcPr/>
+          <w:p>
+            <w:pPr>
+              <w:pStyle w:val="Compact"/>
+              <w:jc w:val="left"/>
+            </w:pPr>
+            <w:r>
+              <w:t xml:space="preserve">Last generation timestamp. Nullable.</w:t>
+            </w:r>
+          </w:p>
+        </w:tc>
+      </w:tr>
+    </w:tbl>
+    <w:p>
+      <w:pPr>
+        <w:pStyle w:val="BodyText"/>
+      </w:pPr>
+      <w:r>
+        <w:t xml:space="preserve">Migration runs automatically. All three columns added to candidates table.</w:t>
+      </w:r>
+    </w:p>
+    <w:bookmarkEnd w:id="60"/>
+    <w:bookmarkStart w:id="61" w:name="browse-card-display"/>
+    <w:p>
+      <w:pPr>
+        <w:pStyle w:val="Heading2"/>
+      </w:pPr>
+      <w:r>
+        <w:rPr>
+          <w:bCs/>
+          <w:b/>
+        </w:rPr>
+        <w:t xml:space="preserve">Browse Card Display</w:t>
+      </w:r>
+    </w:p>
+    <w:p>
+      <w:pPr>
+        <w:numPr>
+          <w:ilvl w:val="0"/>
+          <w:numId w:val="1001"/>
+        </w:numPr>
+        <w:pStyle w:val="Compact"/>
+      </w:pPr>
+      <w:r>
+        <w:t xml:space="preserve">Rendered below skill tags as two bullet points</w:t>
+      </w:r>
+    </w:p>
+    <w:p>
+      <w:pPr>
+        <w:numPr>
+          <w:ilvl w:val="0"/>
+          <w:numId w:val="1001"/>
+        </w:numPr>
+        <w:pStyle w:val="Compact"/>
+      </w:pPr>
+      <w:r>
+        <w:t xml:space="preserve">Hidden entirely if both ai_insight_1 and ai_insight_2 are null</w:t>
+      </w:r>
+    </w:p>
+    <w:p>
+      <w:pPr>
+        <w:numPr>
+          <w:ilvl w:val="0"/>
+          <w:numId w:val="1001"/>
+        </w:numPr>
+        <w:pStyle w:val="Compact"/>
+      </w:pPr>
+      <w:r>
+        <w:t xml:space="preserve">No label or header — insights render directly</w:t>
+      </w:r>
+    </w:p>
+    <w:p>
+      <w:pPr>
+        <w:numPr>
+          <w:ilvl w:val="0"/>
+          <w:numId w:val="1001"/>
+        </w:numPr>
+        <w:pStyle w:val="Compact"/>
+      </w:pPr>
+      <w:r>
+        <w:t xml:space="preserve">Same font size as skill tag text</w:t>
+      </w:r>
+    </w:p>
+    <w:p>
+      <w:pPr>
+        <w:numPr>
+          <w:ilvl w:val="0"/>
+          <w:numId w:val="1001"/>
+        </w:numPr>
+        <w:pStyle w:val="Compact"/>
+      </w:pPr>
+      <w:r>
+        <w:t xml:space="preserve">Charcoal text on card background — no special styling</w:t>
+      </w:r>
+    </w:p>
+    <w:p>
+      <w:pPr>
+        <w:pStyle w:val="FirstParagraph"/>
+      </w:pPr>
+      <w:r>
+        <w:rPr>
+          <w:bCs/>
+          <w:b/>
+        </w:rPr>
+        <w:t xml:space="preserve">SECTION 12</w:t>
+      </w:r>
+    </w:p>
+    <w:bookmarkEnd w:id="61"/>
+    <w:bookmarkEnd w:id="62"/>
+    <w:bookmarkStart w:id="64" w:name="browse-page-hire-staff"/>
     <w:p>
       <w:pPr>
         <w:pStyle w:val="Heading1"/>
@@ -7293,7 +7976,7 @@
         </w:tc>
       </w:tr>
     </w:tbl>
-    <w:bookmarkStart w:id="57" w:name="browse-card-candidate-card-design"/>
+    <w:bookmarkStart w:id="63" w:name="browse-card-candidate-card-design"/>
     <w:p>
       <w:pPr>
         <w:pStyle w:val="Heading2"/>
@@ -7645,9 +8328,9 @@
         <w:t xml:space="preserve">SECTION 13</w:t>
       </w:r>
     </w:p>
-    <w:bookmarkEnd w:id="57"/>
-    <w:bookmarkEnd w:id="58"/>
-    <w:bookmarkStart w:id="59" w:name="tech-stack"/>
+    <w:bookmarkEnd w:id="63"/>
+    <w:bookmarkEnd w:id="64"/>
+    <w:bookmarkStart w:id="65" w:name="tech-stack"/>
     <w:p>
       <w:pPr>
         <w:pStyle w:val="Heading1"/>
@@ -8194,8 +8877,8 @@
         <w:t xml:space="preserve">SECTION 14</w:t>
       </w:r>
     </w:p>
-    <w:bookmarkEnd w:id="59"/>
-    <w:bookmarkStart w:id="62" w:name="key-database-tables"/>
+    <w:bookmarkEnd w:id="65"/>
+    <w:bookmarkStart w:id="68" w:name="key-database-tables"/>
     <w:p>
       <w:pPr>
         <w:pStyle w:val="Heading1"/>
@@ -8208,7 +8891,7 @@
         <w:t xml:space="preserve">Key Database Tables</w:t>
       </w:r>
     </w:p>
-    <w:bookmarkStart w:id="60" w:name="candidates-key-columns"/>
+    <w:bookmarkStart w:id="66" w:name="candidates-key-columns"/>
     <w:p>
       <w:pPr>
         <w:pStyle w:val="Heading2"/>
@@ -9318,9 +10001,123 @@
           </w:p>
         </w:tc>
       </w:tr>
+      <w:tr>
+        <w:tc>
+          <w:tcPr/>
+          <w:p>
+            <w:pPr>
+              <w:pStyle w:val="Compact"/>
+              <w:jc w:val="left"/>
+            </w:pPr>
+            <w:r>
+              <w:t xml:space="preserve">ai_insight_1</w:t>
+            </w:r>
+          </w:p>
+        </w:tc>
+        <w:tc>
+          <w:tcPr/>
+          <w:p>
+            <w:pPr>
+              <w:pStyle w:val="Compact"/>
+              <w:jc w:val="left"/>
+            </w:pPr>
+            <w:r>
+              <w:t xml:space="preserve">text</w:t>
+            </w:r>
+          </w:p>
+        </w:tc>
+        <w:tc>
+          <w:tcPr/>
+          <w:p>
+            <w:pPr>
+              <w:pStyle w:val="Compact"/>
+              <w:jc w:val="left"/>
+            </w:pPr>
+            <w:r>
+              <w:t xml:space="preserve">NEW v6.3 — first AI insight bullet, generated by Claude API</w:t>
+            </w:r>
+          </w:p>
+        </w:tc>
+      </w:tr>
+      <w:tr>
+        <w:tc>
+          <w:tcPr/>
+          <w:p>
+            <w:pPr>
+              <w:pStyle w:val="Compact"/>
+              <w:jc w:val="left"/>
+            </w:pPr>
+            <w:r>
+              <w:t xml:space="preserve">ai_insight_2</w:t>
+            </w:r>
+          </w:p>
+        </w:tc>
+        <w:tc>
+          <w:tcPr/>
+          <w:p>
+            <w:pPr>
+              <w:pStyle w:val="Compact"/>
+              <w:jc w:val="left"/>
+            </w:pPr>
+            <w:r>
+              <w:t xml:space="preserve">text</w:t>
+            </w:r>
+          </w:p>
+        </w:tc>
+        <w:tc>
+          <w:tcPr/>
+          <w:p>
+            <w:pPr>
+              <w:pStyle w:val="Compact"/>
+              <w:jc w:val="left"/>
+            </w:pPr>
+            <w:r>
+              <w:t xml:space="preserve">NEW v6.3 — second AI insight bullet, generated by Claude API</w:t>
+            </w:r>
+          </w:p>
+        </w:tc>
+      </w:tr>
+      <w:tr>
+        <w:tc>
+          <w:tcPr/>
+          <w:p>
+            <w:pPr>
+              <w:pStyle w:val="Compact"/>
+              <w:jc w:val="left"/>
+            </w:pPr>
+            <w:r>
+              <w:t xml:space="preserve">ai_insights_generated_at</w:t>
+            </w:r>
+          </w:p>
+        </w:tc>
+        <w:tc>
+          <w:tcPr/>
+          <w:p>
+            <w:pPr>
+              <w:pStyle w:val="Compact"/>
+              <w:jc w:val="left"/>
+            </w:pPr>
+            <w:r>
+              <w:t xml:space="preserve">timestamp</w:t>
+            </w:r>
+          </w:p>
+        </w:tc>
+        <w:tc>
+          <w:tcPr/>
+          <w:p>
+            <w:pPr>
+              <w:pStyle w:val="Compact"/>
+              <w:jc w:val="left"/>
+            </w:pPr>
+            <w:r>
+              <w:t xml:space="preserve">NEW v6.3 — last insights generation timestamp</w:t>
+            </w:r>
+          </w:p>
+        </w:tc>
+      </w:tr>
     </w:tbl>
-    <w:bookmarkEnd w:id="60"/>
-    <w:bookmarkStart w:id="61" w:name="other-key-tables"/>
+    <w:bookmarkEnd w:id="66"/>
+    <w:bookmarkStart w:id="67" w:name="other-key-tables"/>
     <w:p>
       <w:pPr>
         <w:pStyle w:val="Heading2"/>
@@ -9732,9 +10529,9 @@
         <w:t xml:space="preserve">SECTION 15</w:t>
       </w:r>
     </w:p>
-    <w:bookmarkEnd w:id="61"/>
-    <w:bookmarkEnd w:id="62"/>
-    <w:bookmarkStart w:id="63" w:name="phase-status"/>
+    <w:bookmarkEnd w:id="67"/>
+    <w:bookmarkEnd w:id="68"/>
+    <w:bookmarkStart w:id="69" w:name="phase-status"/>
     <w:p>
       <w:pPr>
         <w:pStyle w:val="Heading1"/>
@@ -10885,6 +11682,44 @@
               <w:jc w:val="left"/>
             </w:pPr>
             <w:r>
+              <w:t xml:space="preserve">AI insights panel — two bullets from profile, AI interview, and second interview scores</w:t>
+            </w:r>
+          </w:p>
+        </w:tc>
+        <w:tc>
+          <w:tcPr/>
+          <w:p>
+            <w:pPr>
+              <w:pStyle w:val="Compact"/>
+              <w:jc w:val="left"/>
+            </w:pPr>
+            <w:r>
+              <w:t xml:space="preserve">Phase 1</w:t>
+            </w:r>
+          </w:p>
+        </w:tc>
+        <w:tc>
+          <w:tcPr/>
+          <w:p>
+            <w:pPr>
+              <w:pStyle w:val="Compact"/>
+              <w:jc w:val="left"/>
+            </w:pPr>
+            <w:r>
+              <w:t xml:space="preserve">LIVE — added v6.3</w:t>
+            </w:r>
+          </w:p>
+        </w:tc>
+      </w:tr>
+      <w:tr>
+        <w:tc>
+          <w:tcPr/>
+          <w:p>
+            <w:pPr>
+              <w:pStyle w:val="Compact"/>
+              <w:jc w:val="left"/>
+            </w:pPr>
+            <w:r>
               <w:t xml:space="preserve">Software proficiency filters</w:t>
             </w:r>
           </w:p>
@@ -11083,7 +11918,7 @@
         <w:t xml:space="preserve">Prepared by Ahmed (Sam) — Confidential — Internal Reference Only</w:t>
       </w:r>
     </w:p>
-    <w:bookmarkEnd w:id="63"/>
+    <w:bookmarkEnd w:id="69"/>
     <w:sectPr/>
   </w:body>
 </w:document>
@@ -11190,8 +12025,87 @@
       </w:pPr>
     </w:lvl>
   </w:abstractNum>
+  <w:abstractNum w:abstractNumId="991">
+    <w:nsid w:val="A991"/>
+    <w:multiLevelType w:val="multilevel"/>
+    <w:lvl w:ilvl="0">
+      <w:numFmt w:val="bullet"/>
+      <w:lvlText w:val="•"/>
+      <w:lvlJc w:val="left"/>
+      <w:pPr>
+        <w:ind w:left="720" w:hanging="480"/>
+      </w:pPr>
+    </w:lvl>
+    <w:lvl w:ilvl="1">
+      <w:numFmt w:val="bullet"/>
+      <w:lvlText w:val="–"/>
+      <w:lvlJc w:val="left"/>
+      <w:pPr>
+        <w:ind w:left="1440" w:hanging="480"/>
+      </w:pPr>
+    </w:lvl>
+    <w:lvl w:ilvl="2">
+      <w:numFmt w:val="bullet"/>
+      <w:lvlText w:val="•"/>
+      <w:lvlJc w:val="left"/>
+      <w:pPr>
+        <w:ind w:left="2160" w:hanging="480"/>
+      </w:pPr>
+    </w:lvl>
+    <w:lvl w:ilvl="3">
+      <w:numFmt w:val="bullet"/>
+      <w:lvlText w:val="–"/>
+      <w:lvlJc w:val="left"/>
+      <w:pPr>
+        <w:ind w:left="2880" w:hanging="480"/>
+      </w:pPr>
+    </w:lvl>
+    <w:lvl w:ilvl="4">
+      <w:numFmt w:val="bullet"/>
+      <w:lvlText w:val="•"/>
+      <w:lvlJc w:val="left"/>
+      <w:pPr>
+        <w:ind w:left="3600" w:hanging="480"/>
+      </w:pPr>
+    </w:lvl>
+    <w:lvl w:ilvl="5">
+      <w:numFmt w:val="bullet"/>
+      <w:lvlText w:val="–"/>
+      <w:lvlJc w:val="left"/>
+      <w:pPr>
+        <w:ind w:left="4320" w:hanging="480"/>
+      </w:pPr>
+    </w:lvl>
+    <w:lvl w:ilvl="6">
+      <w:numFmt w:val="bullet"/>
+      <w:lvlText w:val="•"/>
+      <w:lvlJc w:val="left"/>
+      <w:pPr>
+        <w:ind w:left="5040" w:hanging="480"/>
+      </w:pPr>
+    </w:lvl>
+    <w:lvl w:ilvl="7">
+      <w:numFmt w:val="bullet"/>
+      <w:lvlText w:val="–"/>
+      <w:lvlJc w:val="left"/>
+      <w:pPr>
+        <w:ind w:left="5760" w:hanging="480"/>
+      </w:pPr>
+    </w:lvl>
+    <w:lvl w:ilvl="8">
+      <w:numFmt w:val="bullet"/>
+      <w:lvlText w:val="•"/>
+      <w:lvlJc w:val="left"/>
+      <w:pPr>
+        <w:ind w:left="6480" w:hanging="480"/>
+      </w:pPr>
+    </w:lvl>
+  </w:abstractNum>
   <w:num w:numId="1000">
     <w:abstractNumId w:val="990"/>
+  </w:num>
+  <w:num w:numId="1001">
+    <w:abstractNumId w:val="991"/>
   </w:num>
 </w:numbering>
 </file>

</xml_diff>

<commit_message>
Replace StaffVA Scope v6.3 with latest version
Co-Authored-By: Claude Opus 4.6 (1M context) <noreply@anthropic.com>
</commit_message>
<xml_diff>
--- a/data-room/StaffVA_Scope_v6_3.docx
+++ b/data-room/StaffVA_Scope_v6_3.docx
@@ -690,6 +690,32 @@
             </w:pPr>
             <w:r>
               <w:t xml:space="preserve">Two AI-generated insight bullets rendered on each browse card below the skill tags. Generated by Claude API async background job from three data sources: candidate profile (bio, tagline, skills, tools, role category, US client experience, years of experience), AI first interview score and result tier, and second interview scorecard (Communication Clarity, Professional Demeanor, Role Knowledge scores). The 2 strongest insights stored on the candidate record. Regenerates on profile approval, AI interview completion, and second interview scoring. Moved from Phase 2 to Phase 1.</w:t>
+            </w:r>
+          </w:p>
+        </w:tc>
+      </w:tr>
+      <w:tr>
+        <w:tc>
+          <w:tcPr/>
+          <w:p>
+            <w:pPr>
+              <w:pStyle w:val="Compact"/>
+              <w:jc w:val="left"/>
+            </w:pPr>
+            <w:r>
+              <w:t xml:space="preserve">Browse Page — Dynamic Skills Sidebar</w:t>
+            </w:r>
+          </w:p>
+        </w:tc>
+        <w:tc>
+          <w:tcPr/>
+          <w:p>
+            <w:pPr>
+              <w:pStyle w:val="Compact"/>
+              <w:jc w:val="left"/>
+            </w:pPr>
+            <w:r>
+              <w:t xml:space="preserve">Skills filter in the browse sidebar now dynamically populates based on the current search and filter result set. Skills shown are aggregated and counted from the skills array across all candidates matching the current query. Sidebar shows up to 15 most frequent skills in the result set with a See more / See less toggle. Skills list updates on every search or filter change. Replaces any static skills filter list. Search bar autocomplete also updated to suggest role-specific subspecialties derived from candidate skill data in the database.</w:t>
             </w:r>
           </w:p>
         </w:tc>
@@ -7675,12 +7701,556 @@
           <w:bCs/>
           <w:b/>
         </w:rPr>
-        <w:t xml:space="preserve">SECTION 12</w:t>
+        <w:t xml:space="preserve">SECTION 11D</w:t>
       </w:r>
     </w:p>
     <w:bookmarkEnd w:id="61"/>
     <w:bookmarkEnd w:id="62"/>
-    <w:bookmarkStart w:id="64" w:name="browse-page-hire-staff"/>
+    <w:bookmarkStart w:id="67" w:name="dynamic-skills-sidebar-browse-page"/>
+    <w:p>
+      <w:pPr>
+        <w:pStyle w:val="Heading1"/>
+      </w:pPr>
+      <w:r>
+        <w:rPr>
+          <w:bCs/>
+          <w:b/>
+        </w:rPr>
+        <w:t xml:space="preserve">Dynamic Skills Sidebar — Browse Page</w:t>
+      </w:r>
+    </w:p>
+    <w:p>
+      <w:pPr>
+        <w:pStyle w:val="FirstParagraph"/>
+      </w:pPr>
+      <w:r>
+        <w:t xml:space="preserve">The skills filter in the browse sidebar dynamically populates based on the active search and filter result set. It is not a static master list. Every search or filter change triggers a new aggregation of skills across the matching candidate pool.</w:t>
+      </w:r>
+    </w:p>
+    <w:bookmarkStart w:id="63" w:name="how-it-works"/>
+    <w:p>
+      <w:pPr>
+        <w:pStyle w:val="Heading2"/>
+      </w:pPr>
+      <w:r>
+        <w:rPr>
+          <w:bCs/>
+          <w:b/>
+        </w:rPr>
+        <w:t xml:space="preserve">How It Works</w:t>
+      </w:r>
+    </w:p>
+    <w:tbl>
+      <w:tblPr>
+        <w:tblStyle w:val="Table"/>
+        <w:tblW w:type="pct" w:w="5000"/>
+        <w:tblLook w:firstRow="1" w:lastRow="0" w:firstColumn="0" w:lastColumn="0" w:noHBand="0" w:noVBand="0" w:val="0020"/>
+        <w:jc w:val="start"/>
+      </w:tblPr>
+      <w:tblGrid>
+        <w:gridCol w:w="3960"/>
+        <w:gridCol w:w="3960"/>
+      </w:tblGrid>
+      <w:tr>
+        <w:trPr>
+          <w:tblHeader w:val="true"/>
+        </w:trPr>
+        <w:tc>
+          <w:tcPr/>
+          <w:p>
+            <w:pPr>
+              <w:pStyle w:val="Compact"/>
+              <w:jc w:val="left"/>
+            </w:pPr>
+            <w:r>
+              <w:rPr>
+                <w:bCs/>
+                <w:b/>
+              </w:rPr>
+              <w:t xml:space="preserve">Step</w:t>
+            </w:r>
+          </w:p>
+        </w:tc>
+        <w:tc>
+          <w:tcPr/>
+          <w:p>
+            <w:pPr>
+              <w:pStyle w:val="Compact"/>
+              <w:jc w:val="left"/>
+            </w:pPr>
+            <w:r>
+              <w:rPr>
+                <w:bCs/>
+                <w:b/>
+              </w:rPr>
+              <w:t xml:space="preserve">Detail</w:t>
+            </w:r>
+          </w:p>
+        </w:tc>
+      </w:tr>
+      <w:tr>
+        <w:tc>
+          <w:tcPr/>
+          <w:p>
+            <w:pPr>
+              <w:pStyle w:val="Compact"/>
+              <w:jc w:val="left"/>
+            </w:pPr>
+            <w:r>
+              <w:t xml:space="preserve">Client searches or filters</w:t>
+            </w:r>
+          </w:p>
+        </w:tc>
+        <w:tc>
+          <w:tcPr/>
+          <w:p>
+            <w:pPr>
+              <w:pStyle w:val="Compact"/>
+              <w:jc w:val="left"/>
+            </w:pPr>
+            <w:r>
+              <w:t xml:space="preserve">Any search term, role category, country, rate, availability, or other filter change triggers the skills aggregation</w:t>
+            </w:r>
+          </w:p>
+        </w:tc>
+      </w:tr>
+      <w:tr>
+        <w:tc>
+          <w:tcPr/>
+          <w:p>
+            <w:pPr>
+              <w:pStyle w:val="Compact"/>
+              <w:jc w:val="left"/>
+            </w:pPr>
+            <w:r>
+              <w:t xml:space="preserve">API aggregates skills</w:t>
+            </w:r>
+          </w:p>
+        </w:tc>
+        <w:tc>
+          <w:tcPr/>
+          <w:p>
+            <w:pPr>
+              <w:pStyle w:val="Compact"/>
+              <w:jc w:val="left"/>
+            </w:pPr>
+            <w:r>
+              <w:t xml:space="preserve">Browse API query unnests the skills array across all matching candidates, counts frequency of each skill, orders by count descending</w:t>
+            </w:r>
+          </w:p>
+        </w:tc>
+      </w:tr>
+      <w:tr>
+        <w:tc>
+          <w:tcPr/>
+          <w:p>
+            <w:pPr>
+              <w:pStyle w:val="Compact"/>
+              <w:jc w:val="left"/>
+            </w:pPr>
+            <w:r>
+              <w:t xml:space="preserve">Sidebar populates</w:t>
+            </w:r>
+          </w:p>
+        </w:tc>
+        <w:tc>
+          <w:tcPr/>
+          <w:p>
+            <w:pPr>
+              <w:pStyle w:val="Compact"/>
+              <w:jc w:val="left"/>
+            </w:pPr>
+            <w:r>
+              <w:t xml:space="preserve">Top 15 most frequent skills in the result set render as checkboxes in the Skills section of the filter sidebar</w:t>
+            </w:r>
+          </w:p>
+        </w:tc>
+      </w:tr>
+      <w:tr>
+        <w:tc>
+          <w:tcPr/>
+          <w:p>
+            <w:pPr>
+              <w:pStyle w:val="Compact"/>
+              <w:jc w:val="left"/>
+            </w:pPr>
+            <w:r>
+              <w:t xml:space="preserve">Client selects a skill</w:t>
+            </w:r>
+          </w:p>
+        </w:tc>
+        <w:tc>
+          <w:tcPr/>
+          <w:p>
+            <w:pPr>
+              <w:pStyle w:val="Compact"/>
+              <w:jc w:val="left"/>
+            </w:pPr>
+            <w:r>
+              <w:t xml:space="preserve">Skill filter applies to the browse query — results narrow to candidates who have that skill in their skills array</w:t>
+            </w:r>
+          </w:p>
+        </w:tc>
+      </w:tr>
+      <w:tr>
+        <w:tc>
+          <w:tcPr/>
+          <w:p>
+            <w:pPr>
+              <w:pStyle w:val="Compact"/>
+              <w:jc w:val="left"/>
+            </w:pPr>
+            <w:r>
+              <w:t xml:space="preserve">See more / See less</w:t>
+            </w:r>
+          </w:p>
+        </w:tc>
+        <w:tc>
+          <w:tcPr/>
+          <w:p>
+            <w:pPr>
+              <w:pStyle w:val="Compact"/>
+              <w:jc w:val="left"/>
+            </w:pPr>
+            <w:r>
+              <w:t xml:space="preserve">Sidebar shows top 8 by default. See more expands to show all 15. See less collapses back to 8.</w:t>
+            </w:r>
+          </w:p>
+        </w:tc>
+      </w:tr>
+      <w:tr>
+        <w:tc>
+          <w:tcPr/>
+          <w:p>
+            <w:pPr>
+              <w:pStyle w:val="Compact"/>
+              <w:jc w:val="left"/>
+            </w:pPr>
+            <w:r>
+              <w:t xml:space="preserve">No matching skills</w:t>
+            </w:r>
+          </w:p>
+        </w:tc>
+        <w:tc>
+          <w:tcPr/>
+          <w:p>
+            <w:pPr>
+              <w:pStyle w:val="Compact"/>
+              <w:jc w:val="left"/>
+            </w:pPr>
+            <w:r>
+              <w:t xml:space="preserve">If result set has fewer than 2 distinct skills, Skills section is hidden from sidebar entirely</w:t>
+            </w:r>
+          </w:p>
+        </w:tc>
+      </w:tr>
+    </w:tbl>
+    <w:bookmarkEnd w:id="63"/>
+    <w:bookmarkStart w:id="64" w:name="Xcd7bf01a05437cc1236574c15d3f9eae9110301"/>
+    <w:p>
+      <w:pPr>
+        <w:pStyle w:val="Heading2"/>
+      </w:pPr>
+      <w:r>
+        <w:rPr>
+          <w:bCs/>
+          <w:b/>
+        </w:rPr>
+        <w:t xml:space="preserve">Search Autocomplete — Role Subspecialty Suggestions</w:t>
+      </w:r>
+    </w:p>
+    <w:p>
+      <w:pPr>
+        <w:pStyle w:val="FirstParagraph"/>
+      </w:pPr>
+      <w:r>
+        <w:t xml:space="preserve">When a client types in the search bar, autocomplete suggestions are derived from candidate skill data in the database — not a hardcoded list. Suggestions surface role-specific subspecialties that exist in the candidate pool.</w:t>
+      </w:r>
+    </w:p>
+    <w:tbl>
+      <w:tblPr>
+        <w:tblStyle w:val="Table"/>
+        <w:tblW w:type="pct" w:w="5000"/>
+        <w:tblLook w:firstRow="1" w:lastRow="0" w:firstColumn="0" w:lastColumn="0" w:noHBand="0" w:noVBand="0" w:val="0020"/>
+        <w:jc w:val="start"/>
+      </w:tblPr>
+      <w:tblGrid>
+        <w:gridCol w:w="3960"/>
+        <w:gridCol w:w="3960"/>
+      </w:tblGrid>
+      <w:tr>
+        <w:trPr>
+          <w:tblHeader w:val="true"/>
+        </w:trPr>
+        <w:tc>
+          <w:tcPr/>
+          <w:p>
+            <w:pPr>
+              <w:pStyle w:val="Compact"/>
+              <w:jc w:val="left"/>
+            </w:pPr>
+            <w:r>
+              <w:rPr>
+                <w:bCs/>
+                <w:b/>
+              </w:rPr>
+              <w:t xml:space="preserve">Detail</w:t>
+            </w:r>
+          </w:p>
+        </w:tc>
+        <w:tc>
+          <w:tcPr/>
+          <w:p>
+            <w:pPr>
+              <w:pStyle w:val="Compact"/>
+              <w:jc w:val="left"/>
+            </w:pPr>
+            <w:r>
+              <w:rPr>
+                <w:bCs/>
+                <w:b/>
+              </w:rPr>
+              <w:t xml:space="preserve">Spec</w:t>
+            </w:r>
+          </w:p>
+        </w:tc>
+      </w:tr>
+      <w:tr>
+        <w:tc>
+          <w:tcPr/>
+          <w:p>
+            <w:pPr>
+              <w:pStyle w:val="Compact"/>
+              <w:jc w:val="left"/>
+            </w:pPr>
+            <w:r>
+              <w:t xml:space="preserve">Trigger</w:t>
+            </w:r>
+          </w:p>
+        </w:tc>
+        <w:tc>
+          <w:tcPr/>
+          <w:p>
+            <w:pPr>
+              <w:pStyle w:val="Compact"/>
+              <w:jc w:val="left"/>
+            </w:pPr>
+            <w:r>
+              <w:t xml:space="preserve">After 2 characters typed in search bar</w:t>
+            </w:r>
+          </w:p>
+        </w:tc>
+      </w:tr>
+      <w:tr>
+        <w:tc>
+          <w:tcPr/>
+          <w:p>
+            <w:pPr>
+              <w:pStyle w:val="Compact"/>
+              <w:jc w:val="left"/>
+            </w:pPr>
+            <w:r>
+              <w:t xml:space="preserve">Query</w:t>
+            </w:r>
+          </w:p>
+        </w:tc>
+        <w:tc>
+          <w:tcPr/>
+          <w:p>
+            <w:pPr>
+              <w:pStyle w:val="Compact"/>
+              <w:jc w:val="left"/>
+            </w:pPr>
+            <w:r>
+              <w:t xml:space="preserve">Searches role_category and skills array for matching terms across approved candidates</w:t>
+            </w:r>
+          </w:p>
+        </w:tc>
+      </w:tr>
+      <w:tr>
+        <w:tc>
+          <w:tcPr/>
+          <w:p>
+            <w:pPr>
+              <w:pStyle w:val="Compact"/>
+              <w:jc w:val="left"/>
+            </w:pPr>
+            <w:r>
+              <w:t xml:space="preserve">Display</w:t>
+            </w:r>
+          </w:p>
+        </w:tc>
+        <w:tc>
+          <w:tcPr/>
+          <w:p>
+            <w:pPr>
+              <w:pStyle w:val="Compact"/>
+              <w:jc w:val="left"/>
+            </w:pPr>
+            <w:r>
+              <w:t xml:space="preserve">Up to 6 suggestions shown below search bar. Bold the matching typed portion, normal weight for the rest</w:t>
+            </w:r>
+          </w:p>
+        </w:tc>
+      </w:tr>
+      <w:tr>
+        <w:tc>
+          <w:tcPr/>
+          <w:p>
+            <w:pPr>
+              <w:pStyle w:val="Compact"/>
+              <w:jc w:val="left"/>
+            </w:pPr>
+            <w:r>
+              <w:t xml:space="preserve">Selection</w:t>
+            </w:r>
+          </w:p>
+        </w:tc>
+        <w:tc>
+          <w:tcPr/>
+          <w:p>
+            <w:pPr>
+              <w:pStyle w:val="Compact"/>
+              <w:jc w:val="left"/>
+            </w:pPr>
+            <w:r>
+              <w:t xml:space="preserve">Clicking a suggestion populates search bar and runs search immediately</w:t>
+            </w:r>
+          </w:p>
+        </w:tc>
+      </w:tr>
+      <w:tr>
+        <w:tc>
+          <w:tcPr/>
+          <w:p>
+            <w:pPr>
+              <w:pStyle w:val="Compact"/>
+              <w:jc w:val="left"/>
+            </w:pPr>
+            <w:r>
+              <w:t xml:space="preserve">No results</w:t>
+            </w:r>
+          </w:p>
+        </w:tc>
+        <w:tc>
+          <w:tcPr/>
+          <w:p>
+            <w:pPr>
+              <w:pStyle w:val="Compact"/>
+              <w:jc w:val="left"/>
+            </w:pPr>
+            <w:r>
+              <w:t xml:space="preserve">Autocomplete dropdown hidden — no empty state shown</w:t>
+            </w:r>
+          </w:p>
+        </w:tc>
+      </w:tr>
+    </w:tbl>
+    <w:bookmarkEnd w:id="64"/>
+    <w:bookmarkStart w:id="65" w:name="api-changes"/>
+    <w:p>
+      <w:pPr>
+        <w:pStyle w:val="Heading2"/>
+      </w:pPr>
+      <w:r>
+        <w:rPr>
+          <w:bCs/>
+          <w:b/>
+        </w:rPr>
+        <w:t xml:space="preserve">API Changes</w:t>
+      </w:r>
+    </w:p>
+    <w:p>
+      <w:pPr>
+        <w:pStyle w:val="FirstParagraph"/>
+      </w:pPr>
+      <w:r>
+        <w:t xml:space="preserve">Browse API route requires two changes:</w:t>
+      </w:r>
+    </w:p>
+    <w:p>
+      <w:pPr>
+        <w:pStyle w:val="BodyText"/>
+      </w:pPr>
+      <w:r>
+        <w:t xml:space="preserve">One — the main browse query must return a skills aggregation alongside the candidate results. The aggregation unnests the skills array across the filtered result set, counts each skill, and returns the top 15 ordered by frequency. This runs in the same query as the candidate results using a subquery or CTE — not a separate API call.</w:t>
+      </w:r>
+    </w:p>
+    <w:p>
+      <w:pPr>
+        <w:pStyle w:val="BodyText"/>
+      </w:pPr>
+      <w:r>
+        <w:t xml:space="preserve">Two — a new lightweight autocomplete endpoint at</w:t>
+      </w:r>
+      <w:r>
+        <w:t xml:space="preserve"> </w:t>
+      </w:r>
+      <w:r>
+        <w:rPr>
+          <w:rStyle w:val="VerbatimChar"/>
+        </w:rPr>
+        <w:t xml:space="preserve">/api/candidates/autocomplete</w:t>
+      </w:r>
+      <w:r>
+        <w:t xml:space="preserve"> </w:t>
+      </w:r>
+      <w:r>
+        <w:t xml:space="preserve">accepts a query string param</w:t>
+      </w:r>
+      <w:r>
+        <w:t xml:space="preserve"> </w:t>
+      </w:r>
+      <w:r>
+        <w:rPr>
+          <w:rStyle w:val="VerbatimChar"/>
+        </w:rPr>
+        <w:t xml:space="preserve">q</w:t>
+      </w:r>
+      <w:r>
+        <w:t xml:space="preserve"> </w:t>
+      </w:r>
+      <w:r>
+        <w:t xml:space="preserve">and returns up to 6 matching role or skill suggestions from approved candidates. Response is a JSON array of strings.</w:t>
+      </w:r>
+    </w:p>
+    <w:bookmarkEnd w:id="65"/>
+    <w:bookmarkStart w:id="66" w:name="no-scope-change-to-existing-filters"/>
+    <w:p>
+      <w:pPr>
+        <w:pStyle w:val="Heading2"/>
+      </w:pPr>
+      <w:r>
+        <w:rPr>
+          <w:bCs/>
+          <w:b/>
+        </w:rPr>
+        <w:t xml:space="preserve">No Scope Change to Existing Filters</w:t>
+      </w:r>
+    </w:p>
+    <w:p>
+      <w:pPr>
+        <w:pStyle w:val="FirstParagraph"/>
+      </w:pPr>
+      <w:r>
+        <w:t xml:space="preserve">All existing filter options — country, rate slider, availability, English tier, speaking level, US client experience, interview status, sort — remain exactly as defined in Section 12. The dynamic skills sidebar is additive only.</w:t>
+      </w:r>
+    </w:p>
+    <w:p>
+      <w:pPr>
+        <w:pStyle w:val="BodyText"/>
+      </w:pPr>
+      <w:r>
+        <w:rPr>
+          <w:bCs/>
+          <w:b/>
+        </w:rPr>
+        <w:t xml:space="preserve">SECTION 12</w:t>
+      </w:r>
+    </w:p>
+    <w:bookmarkEnd w:id="66"/>
+    <w:bookmarkEnd w:id="67"/>
+    <w:bookmarkStart w:id="69" w:name="browse-page-hire-staff"/>
     <w:p>
       <w:pPr>
         <w:pStyle w:val="Heading1"/>
@@ -7976,7 +8546,7 @@
         </w:tc>
       </w:tr>
     </w:tbl>
-    <w:bookmarkStart w:id="63" w:name="browse-card-candidate-card-design"/>
+    <w:bookmarkStart w:id="68" w:name="browse-card-candidate-card-design"/>
     <w:p>
       <w:pPr>
         <w:pStyle w:val="Heading2"/>
@@ -8328,9 +8898,9 @@
         <w:t xml:space="preserve">SECTION 13</w:t>
       </w:r>
     </w:p>
-    <w:bookmarkEnd w:id="63"/>
-    <w:bookmarkEnd w:id="64"/>
-    <w:bookmarkStart w:id="65" w:name="tech-stack"/>
+    <w:bookmarkEnd w:id="68"/>
+    <w:bookmarkEnd w:id="69"/>
+    <w:bookmarkStart w:id="70" w:name="tech-stack"/>
     <w:p>
       <w:pPr>
         <w:pStyle w:val="Heading1"/>
@@ -8877,8 +9447,8 @@
         <w:t xml:space="preserve">SECTION 14</w:t>
       </w:r>
     </w:p>
-    <w:bookmarkEnd w:id="65"/>
-    <w:bookmarkStart w:id="68" w:name="key-database-tables"/>
+    <w:bookmarkEnd w:id="70"/>
+    <w:bookmarkStart w:id="73" w:name="key-database-tables"/>
     <w:p>
       <w:pPr>
         <w:pStyle w:val="Heading1"/>
@@ -8891,7 +9461,7 @@
         <w:t xml:space="preserve">Key Database Tables</w:t>
       </w:r>
     </w:p>
-    <w:bookmarkStart w:id="66" w:name="candidates-key-columns"/>
+    <w:bookmarkStart w:id="71" w:name="candidates-key-columns"/>
     <w:p>
       <w:pPr>
         <w:pStyle w:val="Heading2"/>
@@ -10116,8 +10686,8 @@
         </w:tc>
       </w:tr>
     </w:tbl>
-    <w:bookmarkEnd w:id="66"/>
-    <w:bookmarkStart w:id="67" w:name="other-key-tables"/>
+    <w:bookmarkEnd w:id="71"/>
+    <w:bookmarkStart w:id="72" w:name="other-key-tables"/>
     <w:p>
       <w:pPr>
         <w:pStyle w:val="Heading2"/>
@@ -10529,9 +11099,9 @@
         <w:t xml:space="preserve">SECTION 15</w:t>
       </w:r>
     </w:p>
-    <w:bookmarkEnd w:id="67"/>
-    <w:bookmarkEnd w:id="68"/>
-    <w:bookmarkStart w:id="69" w:name="phase-status"/>
+    <w:bookmarkEnd w:id="72"/>
+    <w:bookmarkEnd w:id="73"/>
+    <w:bookmarkStart w:id="74" w:name="phase-status"/>
     <w:p>
       <w:pPr>
         <w:pStyle w:val="Heading1"/>
@@ -11720,6 +12290,82 @@
               <w:jc w:val="left"/>
             </w:pPr>
             <w:r>
+              <w:t xml:space="preserve">Browse page — dynamic skills sidebar populated from result set aggregation</w:t>
+            </w:r>
+          </w:p>
+        </w:tc>
+        <w:tc>
+          <w:tcPr/>
+          <w:p>
+            <w:pPr>
+              <w:pStyle w:val="Compact"/>
+              <w:jc w:val="left"/>
+            </w:pPr>
+            <w:r>
+              <w:t xml:space="preserve">Phase 1</w:t>
+            </w:r>
+          </w:p>
+        </w:tc>
+        <w:tc>
+          <w:tcPr/>
+          <w:p>
+            <w:pPr>
+              <w:pStyle w:val="Compact"/>
+              <w:jc w:val="left"/>
+            </w:pPr>
+            <w:r>
+              <w:t xml:space="preserve">LIVE — added v6.3</w:t>
+            </w:r>
+          </w:p>
+        </w:tc>
+      </w:tr>
+      <w:tr>
+        <w:tc>
+          <w:tcPr/>
+          <w:p>
+            <w:pPr>
+              <w:pStyle w:val="Compact"/>
+              <w:jc w:val="left"/>
+            </w:pPr>
+            <w:r>
+              <w:t xml:space="preserve">Browse page — search autocomplete with role subspecialty suggestions from candidate data</w:t>
+            </w:r>
+          </w:p>
+        </w:tc>
+        <w:tc>
+          <w:tcPr/>
+          <w:p>
+            <w:pPr>
+              <w:pStyle w:val="Compact"/>
+              <w:jc w:val="left"/>
+            </w:pPr>
+            <w:r>
+              <w:t xml:space="preserve">Phase 1</w:t>
+            </w:r>
+          </w:p>
+        </w:tc>
+        <w:tc>
+          <w:tcPr/>
+          <w:p>
+            <w:pPr>
+              <w:pStyle w:val="Compact"/>
+              <w:jc w:val="left"/>
+            </w:pPr>
+            <w:r>
+              <w:t xml:space="preserve">LIVE — added v6.3</w:t>
+            </w:r>
+          </w:p>
+        </w:tc>
+      </w:tr>
+      <w:tr>
+        <w:tc>
+          <w:tcPr/>
+          <w:p>
+            <w:pPr>
+              <w:pStyle w:val="Compact"/>
+              <w:jc w:val="left"/>
+            </w:pPr>
+            <w:r>
               <w:t xml:space="preserve">Software proficiency filters</w:t>
             </w:r>
           </w:p>
@@ -11918,7 +12564,7 @@
         <w:t xml:space="preserve">Prepared by Ahmed (Sam) — Confidential — Internal Reference Only</w:t>
       </w:r>
     </w:p>
-    <w:bookmarkEnd w:id="69"/>
+    <w:bookmarkEnd w:id="74"/>
     <w:sectPr/>
   </w:body>
 </w:document>

</xml_diff>